<commit_message>
feat(register): show a box and exit with code 2 when Rewind can't start
A setting that failed validation, a log level Rewind doesn't know or a
failed migration ended Rewind before its window opened, with nothing on
screen. Main now catches a failure to build or start the host, logs it
when the logger is running, shows the reason in a plain message box and
exits with code 2.

UI-5 allows that one native box, since there's no shell yet to show a
dialog, and OBS-5 describes it. Build Plan 6.2 has the launcher leave
Rewind down on code 2 rather than bring the box back each time someone
clicks OK. Code 1 still means relaunch, because Task Manager's End task
and taskkill /F leave 1. The README and the clerk handbook say what the
box means.

Co-Authored-By: Claude Opus 5.5 <noreply@anthropic.com>
</commit_message>
<xml_diff>
--- a/docs/Rewind - Build Plan.docx
+++ b/docs/Rewind - Build Plan.docx
@@ -4512,7 +4512,7 @@
         </w:numPr>
       </w:pPr>
       <w:r>
-        <w:t xml:space="preserve">Run tools\launcher.ps1 at sign-in from Task Scheduler. It starts the newest version and relaunches it whenever it exits, unless Shut Down was used.</w:t>
+        <w:t xml:space="preserve">Run tools\launcher.ps1 at sign-in from Task Scheduler. It starts the newest version and relaunches it whenever it exits, unless Shut Down was used or Rewind couldn't start.</w:t>
       </w:r>
     </w:p>
     <w:p>
@@ -4524,7 +4524,19 @@
         </w:numPr>
       </w:pPr>
       <w:r>
-        <w:t xml:space="preserve">Give the launcher a backoff and a cap on attempts, so a release that crashes as it starts, such as one whose migration or shell fails, gives up after a few tries instead of restarting forever. It's OBS-5's rule one level up: recovery never reopens what just crashed on its own.</w:t>
+        <w:t xml:space="preserve">Rewind exits with code 2 when it can't start, such as with a setting that fails validation or a migration that fails, after showing why in a message box. Leave it down then, since relaunching would only bring the box back each time someone clicks OK. Code 1 still means relaunch: it's what Task Manager's End task and taskkill /F leave.</w:t>
+      </w:r>
+    </w:p>
+    <w:p>
+      <w:pPr>
+        <w:pStyle w:val="ListParagraph"/>
+        <w:numPr>
+          <w:ilvl w:val="0"/>
+          <w:numId w:val="51"/>
+        </w:numPr>
+      </w:pPr>
+      <w:r>
+        <w:t xml:space="preserve">Give the launcher a backoff and a cap on attempts, so a release that crashes as it starts, such as one whose shell fails, gives up after a few tries instead of restarting forever. It's OBS-5's rule one level up: recovery never reopens what just crashed on its own.</w:t>
       </w:r>
     </w:p>
     <w:p>

</xml_diff>